<commit_message>
gradle setup like nto template
</commit_message>
<xml_diff>
--- a/Задание. Инженерный тур.docx
+++ b/Задание. Инженерный тур.docx
@@ -319,7 +319,7 @@
           <w:sz w:val="24"/>
           <w:szCs w:val="24"/>
         </w:rPr>
-        <w:t xml:space="preserve">Целевая версия ОС: Android 16 (API 36)</w:t>
+        <w:t xml:space="preserve">Целевая версия ОС: Android 15 (API 35)</w:t>
       </w:r>
     </w:p>
     <w:p>
@@ -541,7 +541,7 @@
           <w:sz w:val="24"/>
           <w:szCs w:val="24"/>
         </w:rPr>
-        <w:t xml:space="preserve">Java 17</w:t>
+        <w:t xml:space="preserve">Kotlin</w:t>
       </w:r>
     </w:p>
     <w:p>
@@ -579,7 +579,7 @@
           <w:sz w:val="24"/>
           <w:szCs w:val="24"/>
         </w:rPr>
-        <w:t xml:space="preserve">H2</w:t>
+        <w:t xml:space="preserve">PostgreSQL</w:t>
       </w:r>
     </w:p>
     <w:p>
@@ -599,6 +599,25 @@
           <w:szCs w:val="24"/>
         </w:rPr>
         <w:t xml:space="preserve">Liquibase</w:t>
+      </w:r>
+    </w:p>
+    <w:p>
+      <w:pPr>
+        <w:pStyle w:val="ListParagraph"/>
+        <w:numPr>
+          <w:ilvl w:val="0"/>
+          <w:numId w:val="2"/>
+        </w:numPr>
+        <w:spacing w:after="60" w:line="276"/>
+        <w:jc w:val="both"/>
+      </w:pPr>
+      <w:r>
+        <w:rPr>
+          <w:rFonts w:ascii="Times New Roman" w:cs="Times New Roman" w:eastAsia="Times New Roman" w:hAnsi="Times New Roman"/>
+          <w:sz w:val="24"/>
+          <w:szCs w:val="24"/>
+        </w:rPr>
+        <w:t xml:space="preserve">Docker</w:t>
       </w:r>
     </w:p>
     <w:p>
@@ -843,6 +862,25 @@
     </w:p>
     <w:p>
       <w:pPr>
+        <w:pStyle w:val="ListParagraph"/>
+        <w:numPr>
+          <w:ilvl w:val="0"/>
+          <w:numId w:val="2"/>
+        </w:numPr>
+        <w:spacing w:after="60" w:line="276"/>
+        <w:jc w:val="both"/>
+      </w:pPr>
+      <w:r>
+        <w:rPr>
+          <w:rFonts w:ascii="Times New Roman" w:cs="Times New Roman" w:eastAsia="Times New Roman" w:hAnsi="Times New Roman"/>
+          <w:sz w:val="24"/>
+          <w:szCs w:val="24"/>
+        </w:rPr>
+        <w:t xml:space="preserve">Конфигурационный файл Docker для приложения и файл оркестрации контейнеров Docker Compose (с двумя контейнерами: СУБД PostgreSQL и само серверное приложение), с помощью которого можно развернуть и запустить серверную часть.</w:t>
+      </w:r>
+    </w:p>
+    <w:p>
+      <w:pPr>
         <w:spacing w:after="120" w:line="276"/>
         <w:jc w:val="both"/>
       </w:pPr>
@@ -862,7 +900,7 @@
           <w:sz w:val="24"/>
           <w:szCs w:val="24"/>
         </w:rPr>
-        <w:t xml:space="preserve">если серверное приложение переведено на PostgreSQL, наличие файла Docker Compose (с двумя контейнерами: СУБД PostgreSQL и само серверное приложение) является обязательным. Описанные выше артефакты оцениваются на каждом чекпоинте. APK-файл и JAR-файл должны иметь следующие имена: Client_vN.apk и Server_vN.jar, где N — номер чекпоинта.</w:t>
+        <w:t xml:space="preserve">описанные выше артефакты оцениваются на каждом чекпоинте. APK-файл и JAR-файл должны иметь следующие имена: Client_vN.apk и Server_vN.jar, где N — номер чекпоинта.</w:t>
       </w:r>
     </w:p>
     <w:p>
@@ -1027,7 +1065,7 @@
           <w:sz w:val="24"/>
           <w:szCs w:val="24"/>
         </w:rPr>
-        <w:t xml:space="preserve">Схема базы данных изменяется только добавлением новых changeset-файлов Liquibase. Изменять или удалять существующие файлы из db.changelog запрещено.</w:t>
+        <w:t xml:space="preserve">Серверная часть разворачивается командой docker compose up: СУБД PostgreSQL и приложение в отдельных контейнерах. Схема базы данных изменяется только добавлением новых changeset-файлов Liquibase. Изменять или удалять существующие файлы из db.changelog запрещено. Дамп исходной БД (структура и данные) размещён в репозитории серверной части в файле db/storage_pg.sql.</w:t>
       </w:r>
     </w:p>
     <w:p>
@@ -3098,6 +3136,25 @@
           <w:sz w:val="24"/>
           <w:szCs w:val="24"/>
         </w:rPr>
+        <w:t xml:space="preserve">Разделение конфигурации на профили (локальный запуск / Docker), параметры подключения к БД читаются из переменных окружения.</w:t>
+      </w:r>
+    </w:p>
+    <w:p>
+      <w:pPr>
+        <w:pStyle w:val="ListParagraph"/>
+        <w:numPr>
+          <w:ilvl w:val="0"/>
+          <w:numId w:val="2"/>
+        </w:numPr>
+        <w:spacing w:after="60" w:line="276"/>
+        <w:jc w:val="both"/>
+      </w:pPr>
+      <w:r>
+        <w:rPr>
+          <w:rFonts w:ascii="Times New Roman" w:cs="Times New Roman" w:eastAsia="Times New Roman" w:hAnsi="Times New Roman"/>
+          <w:sz w:val="24"/>
+          <w:szCs w:val="24"/>
+        </w:rPr>
         <w:t xml:space="preserve">Все известные недоработки заготовки устранены.</w:t>
       </w:r>
     </w:p>
@@ -4248,7 +4305,7 @@
                 <w:sz w:val="20"/>
                 <w:szCs w:val="20"/>
               </w:rPr>
-              <w:t xml:space="preserve">Проверяем добавление в pom-файл maven-плагина, JAR запускается командой java -jar. Если не выпилен ломбок из проекта, обратить внимание на конфиг (желательно исключить ломбок)</w:t>
+              <w:t xml:space="preserve">Проверяем наличие Dockerfile и docker-compose.yml, сервер вместе с PostgreSQL поднимается командой docker compose up; JAR из Releases запускается командой java -jar</w:t>
             </w:r>
           </w:p>
         </w:tc>
@@ -6888,7 +6945,7 @@
                 <w:sz w:val="20"/>
                 <w:szCs w:val="20"/>
               </w:rPr>
-              <w:t xml:space="preserve">В проект добавлен Spring security starter</w:t>
+              <w:t xml:space="preserve">В build.gradle.kts добавлен Spring security starter</w:t>
             </w:r>
           </w:p>
         </w:tc>
@@ -7044,7 +7101,7 @@
                 <w:sz w:val="20"/>
                 <w:szCs w:val="20"/>
               </w:rPr>
-              <w:t xml:space="preserve">2 - расставлены аннотации Column(name = …) и Table(name = …)</w:t>
+              <w:t xml:space="preserve">2 - расставлены аннотации Column(name = …) и Table(name = …), поля объявлены с корректной nullability (Kotlin)</w:t>
             </w:r>
           </w:p>
         </w:tc>
@@ -26834,7 +26891,7 @@
                 <w:sz w:val="20"/>
                 <w:szCs w:val="20"/>
               </w:rPr>
-              <w:t xml:space="preserve">Микросервис переведен с H2 на PostgreSQL</w:t>
+              <w:t xml:space="preserve">Есть разделение на профили (например локальный профиль и профиль для Docker, либо профиль для тестов, проверяем понимание работы с профилями)</w:t>
             </w:r>
           </w:p>
         </w:tc>
@@ -26894,37 +26951,37 @@
                 <w:sz w:val="20"/>
                 <w:szCs w:val="20"/>
               </w:rPr>
-              <w:t xml:space="preserve">4</w:t>
-            </w:r>
-          </w:p>
-        </w:tc>
-        <w:tc>
-          <w:tcPr>
-            <w:tcW w:type="dxa" w:w="1000"/>
-            <w:tcMar>
-              <w:top w:type="dxa" w:w="40"/>
-              <w:left w:type="dxa" w:w="80"/>
-              <w:bottom w:type="dxa" w:w="40"/>
-              <w:right w:type="dxa" w:w="80"/>
-            </w:tcMar>
-            <w:vAlign w:val="center"/>
-          </w:tcPr>
-          <w:p>
-            <w:pPr>
-              <w:spacing w:after="0" w:line="240"/>
-              <w:jc w:val="center"/>
-            </w:pPr>
-            <w:r>
-              <w:rPr>
-                <w:rFonts w:ascii="Times New Roman" w:cs="Times New Roman" w:eastAsia="Times New Roman" w:hAnsi="Times New Roman"/>
-                <w:b w:val="false"/>
-                <w:bCs w:val="false"/>
-                <w:i w:val="false"/>
-                <w:iCs w:val="false"/>
-                <w:sz w:val="20"/>
-                <w:szCs w:val="20"/>
-              </w:rPr>
-              <w:t xml:space="preserve">4</w:t>
+              <w:t xml:space="preserve">2</w:t>
+            </w:r>
+          </w:p>
+        </w:tc>
+        <w:tc>
+          <w:tcPr>
+            <w:tcW w:type="dxa" w:w="1000"/>
+            <w:tcMar>
+              <w:top w:type="dxa" w:w="40"/>
+              <w:left w:type="dxa" w:w="80"/>
+              <w:bottom w:type="dxa" w:w="40"/>
+              <w:right w:type="dxa" w:w="80"/>
+            </w:tcMar>
+            <w:vAlign w:val="center"/>
+          </w:tcPr>
+          <w:p>
+            <w:pPr>
+              <w:spacing w:after="0" w:line="240"/>
+              <w:jc w:val="center"/>
+            </w:pPr>
+            <w:r>
+              <w:rPr>
+                <w:rFonts w:ascii="Times New Roman" w:cs="Times New Roman" w:eastAsia="Times New Roman" w:hAnsi="Times New Roman"/>
+                <w:b w:val="false"/>
+                <w:bCs w:val="false"/>
+                <w:i w:val="false"/>
+                <w:iCs w:val="false"/>
+                <w:sz w:val="20"/>
+                <w:szCs w:val="20"/>
+              </w:rPr>
+              <w:t xml:space="preserve">2</w:t>
             </w:r>
           </w:p>
         </w:tc>
@@ -26951,7 +27008,7 @@
                 <w:sz w:val="20"/>
                 <w:szCs w:val="20"/>
               </w:rPr>
-              <w:t xml:space="preserve">Есть разделение на профили (например дев профиль на h2, а релиз на постгресе, либо есть профиль для тестов, проверяем понимание работы с профилями)</w:t>
+              <w:t xml:space="preserve">Параметры подключения к БД читаются из переменных окружения, в docker-compose.yml нет захардкоженных секретов в образе приложения</w:t>
             </w:r>
           </w:p>
         </w:tc>
@@ -27068,7 +27125,7 @@
                 <w:sz w:val="20"/>
                 <w:szCs w:val="20"/>
               </w:rPr>
-              <w:t xml:space="preserve">Приложение обернуто в docker-контейнет и запускается при помощи docker-compose с рядом стоящим контейнером PostgreSQL</w:t>
+              <w:t xml:space="preserve">Docker-образ собирается многостадийно (сборка отдельно от runtime), итоговый образ на JRE без исходников</w:t>
             </w:r>
           </w:p>
         </w:tc>
@@ -27128,37 +27185,37 @@
                 <w:sz w:val="20"/>
                 <w:szCs w:val="20"/>
               </w:rPr>
-              <w:t xml:space="preserve">4</w:t>
-            </w:r>
-          </w:p>
-        </w:tc>
-        <w:tc>
-          <w:tcPr>
-            <w:tcW w:type="dxa" w:w="1000"/>
-            <w:tcMar>
-              <w:top w:type="dxa" w:w="40"/>
-              <w:left w:type="dxa" w:w="80"/>
-              <w:bottom w:type="dxa" w:w="40"/>
-              <w:right w:type="dxa" w:w="80"/>
-            </w:tcMar>
-            <w:vAlign w:val="center"/>
-          </w:tcPr>
-          <w:p>
-            <w:pPr>
-              <w:spacing w:after="0" w:line="240"/>
-              <w:jc w:val="center"/>
-            </w:pPr>
-            <w:r>
-              <w:rPr>
-                <w:rFonts w:ascii="Times New Roman" w:cs="Times New Roman" w:eastAsia="Times New Roman" w:hAnsi="Times New Roman"/>
-                <w:b w:val="false"/>
-                <w:bCs w:val="false"/>
-                <w:i w:val="false"/>
-                <w:iCs w:val="false"/>
-                <w:sz w:val="20"/>
-                <w:szCs w:val="20"/>
-              </w:rPr>
-              <w:t xml:space="preserve">4</w:t>
+              <w:t xml:space="preserve">2</w:t>
+            </w:r>
+          </w:p>
+        </w:tc>
+        <w:tc>
+          <w:tcPr>
+            <w:tcW w:type="dxa" w:w="1000"/>
+            <w:tcMar>
+              <w:top w:type="dxa" w:w="40"/>
+              <w:left w:type="dxa" w:w="80"/>
+              <w:bottom w:type="dxa" w:w="40"/>
+              <w:right w:type="dxa" w:w="80"/>
+            </w:tcMar>
+            <w:vAlign w:val="center"/>
+          </w:tcPr>
+          <w:p>
+            <w:pPr>
+              <w:spacing w:after="0" w:line="240"/>
+              <w:jc w:val="center"/>
+            </w:pPr>
+            <w:r>
+              <w:rPr>
+                <w:rFonts w:ascii="Times New Roman" w:cs="Times New Roman" w:eastAsia="Times New Roman" w:hAnsi="Times New Roman"/>
+                <w:b w:val="false"/>
+                <w:bCs w:val="false"/>
+                <w:i w:val="false"/>
+                <w:iCs w:val="false"/>
+                <w:sz w:val="20"/>
+                <w:szCs w:val="20"/>
+              </w:rPr>
+              <w:t xml:space="preserve">2</w:t>
             </w:r>
           </w:p>
         </w:tc>
@@ -27178,6 +27235,123 @@
           <w:p>
             <w:pPr>
               <w:spacing w:after="0" w:line="240"/>
+            </w:pPr>
+            <w:r>
+              <w:rPr>
+                <w:rFonts w:ascii="Times New Roman" w:cs="Times New Roman" w:eastAsia="Times New Roman" w:hAnsi="Times New Roman"/>
+                <w:sz w:val="20"/>
+                <w:szCs w:val="20"/>
+              </w:rPr>
+              <w:t xml:space="preserve">Все изменения схемы БД выполнены через Liquibase, дамп db/storage_pg.sql не редактировался вручную</w:t>
+            </w:r>
+          </w:p>
+        </w:tc>
+        <w:tc>
+          <w:tcPr>
+            <w:tcW w:type="dxa" w:w="1000"/>
+            <w:tcMar>
+              <w:top w:type="dxa" w:w="40"/>
+              <w:left w:type="dxa" w:w="80"/>
+              <w:bottom w:type="dxa" w:w="40"/>
+              <w:right w:type="dxa" w:w="80"/>
+            </w:tcMar>
+            <w:vAlign w:val="center"/>
+          </w:tcPr>
+          <w:p>
+            <w:pPr>
+              <w:spacing w:after="0" w:line="240"/>
+              <w:jc w:val="center"/>
+            </w:pPr>
+            <w:r>
+              <w:rPr>
+                <w:rFonts w:ascii="Times New Roman" w:cs="Times New Roman" w:eastAsia="Times New Roman" w:hAnsi="Times New Roman"/>
+                <w:b w:val="false"/>
+                <w:bCs w:val="false"/>
+                <w:i w:val="false"/>
+                <w:iCs w:val="false"/>
+                <w:sz w:val="20"/>
+                <w:szCs w:val="20"/>
+              </w:rPr>
+              <w:t xml:space="preserve">1</w:t>
+            </w:r>
+          </w:p>
+        </w:tc>
+        <w:tc>
+          <w:tcPr>
+            <w:tcW w:type="dxa" w:w="1300"/>
+            <w:tcMar>
+              <w:top w:type="dxa" w:w="40"/>
+              <w:left w:type="dxa" w:w="80"/>
+              <w:bottom w:type="dxa" w:w="40"/>
+              <w:right w:type="dxa" w:w="80"/>
+            </w:tcMar>
+            <w:vAlign w:val="center"/>
+          </w:tcPr>
+          <w:p>
+            <w:pPr>
+              <w:spacing w:after="0" w:line="240"/>
+              <w:jc w:val="center"/>
+            </w:pPr>
+            <w:r>
+              <w:rPr>
+                <w:rFonts w:ascii="Times New Roman" w:cs="Times New Roman" w:eastAsia="Times New Roman" w:hAnsi="Times New Roman"/>
+                <w:b w:val="false"/>
+                <w:bCs w:val="false"/>
+                <w:i w:val="false"/>
+                <w:iCs w:val="false"/>
+                <w:sz w:val="20"/>
+                <w:szCs w:val="20"/>
+              </w:rPr>
+              <w:t xml:space="preserve">4</w:t>
+            </w:r>
+          </w:p>
+        </w:tc>
+        <w:tc>
+          <w:tcPr>
+            <w:tcW w:type="dxa" w:w="1000"/>
+            <w:tcMar>
+              <w:top w:type="dxa" w:w="40"/>
+              <w:left w:type="dxa" w:w="80"/>
+              <w:bottom w:type="dxa" w:w="40"/>
+              <w:right w:type="dxa" w:w="80"/>
+            </w:tcMar>
+            <w:vAlign w:val="center"/>
+          </w:tcPr>
+          <w:p>
+            <w:pPr>
+              <w:spacing w:after="0" w:line="240"/>
+              <w:jc w:val="center"/>
+            </w:pPr>
+            <w:r>
+              <w:rPr>
+                <w:rFonts w:ascii="Times New Roman" w:cs="Times New Roman" w:eastAsia="Times New Roman" w:hAnsi="Times New Roman"/>
+                <w:b w:val="false"/>
+                <w:bCs w:val="false"/>
+                <w:i w:val="false"/>
+                <w:iCs w:val="false"/>
+                <w:sz w:val="20"/>
+                <w:szCs w:val="20"/>
+              </w:rPr>
+              <w:t xml:space="preserve">4</w:t>
+            </w:r>
+          </w:p>
+        </w:tc>
+      </w:tr>
+      <w:tr>
+        <w:tc>
+          <w:tcPr>
+            <w:tcW w:type="dxa" w:w="6338"/>
+            <w:tcMar>
+              <w:top w:type="dxa" w:w="40"/>
+              <w:left w:type="dxa" w:w="80"/>
+              <w:bottom w:type="dxa" w:w="40"/>
+              <w:right w:type="dxa" w:w="80"/>
+            </w:tcMar>
+            <w:vAlign w:val="center"/>
+          </w:tcPr>
+          <w:p>
+            <w:pPr>
+              <w:spacing w:after="0" w:line="240"/>
               <w:jc w:val="center"/>
             </w:pPr>
             <w:r>
@@ -27775,7 +27949,7 @@
                 <w:sz w:val="20"/>
                 <w:szCs w:val="20"/>
               </w:rPr>
-              <w:t xml:space="preserve">Соответствие код-стайлу Java:</w:t>
+              <w:t xml:space="preserve">Соответствие код-стайлу Kotlin (сервер):</w:t>
             </w:r>
           </w:p>
           <w:p>
@@ -27827,7 +28001,7 @@
                 <w:sz w:val="20"/>
                 <w:szCs w:val="20"/>
               </w:rPr>
-              <w:t xml:space="preserve">+1 - нет лишних отступов, все переносы расставлены согласно код-стайлу</w:t>
+              <w:t xml:space="preserve">+1 - нет лишних отступов, все переносы расставлены согласно код-стайлу; не используются !! и платформенные типы без необходимости</w:t>
             </w:r>
           </w:p>
         </w:tc>
@@ -29075,7 +29249,7 @@
                 <w:sz w:val="20"/>
                 <w:szCs w:val="20"/>
               </w:rPr>
-              <w:t xml:space="preserve">Пароли и ключи читаются из переменных сред</w:t>
+              <w:t xml:space="preserve">Пароли и ключи читаются из переменных сред (в т.ч. в docker-compose.yml)</w:t>
             </w:r>
           </w:p>
         </w:tc>
@@ -31786,7 +31960,7 @@
           <w:sz w:val="24"/>
           <w:szCs w:val="24"/>
         </w:rPr>
-        <w:t xml:space="preserve">JAR-файл серверной части приложения в разделе Releases репозитория команды на Gitea (чекпоинты 0–5).</w:t>
+        <w:t xml:space="preserve">JAR-файл серверной части приложения в разделе Releases репозитория команды на Gitea.</w:t>
       </w:r>
     </w:p>
     <w:p>
@@ -31805,7 +31979,7 @@
           <w:sz w:val="24"/>
           <w:szCs w:val="24"/>
         </w:rPr>
-        <w:t xml:space="preserve">Docker-файл для приложения и Docker-compose (чекпоинт 5).</w:t>
+        <w:t xml:space="preserve">Docker-файл для приложения и Docker-compose (на каждом чекпоинте).</w:t>
       </w:r>
     </w:p>
     <w:p>
@@ -31950,7 +32124,7 @@
           <w:sz w:val="24"/>
           <w:szCs w:val="24"/>
         </w:rPr>
-        <w:t xml:space="preserve">До наступления времени каждого Чекпоинта команда должна опубликовать в разделе Releases своих форков: APK-файл клиентской части приложения с названием Client_vN.apk, JAR-файл серверной части приложения с названием Server_vN.jar (чекпоинты 0–5) и Docker-файл для приложения с Docker-compose (чекпоинт 5), доску в PenPot. Файлы с другими названиями не проверяются.</w:t>
+        <w:t xml:space="preserve">До наступления времени каждого Чекпоинта команда должна опубликовать в разделе Releases своих форков: APK-файл клиентской части приложения с названием Client_vN.apk, JAR-файл серверной части приложения с названием Server_vN.jar, Docker-файл для приложения с Docker-compose, доску в PenPot. Файлы с другими названиями не проверяются.</w:t>
       </w:r>
     </w:p>
     <w:p>

</xml_diff>